<commit_message>
Remove upload-screen figure and MD appendices
Drop figure 13 (submission screen capture) from page 24 of the
illustrated report and shift the following text up. Remove all
appendices and numbered citations from the Markdown report, and
regenerate its Word and PDF exports.

Co-Authored-By: Claude Opus 5.5 <noreply@anthropic.com>
Claude-Session: https://claude.ai/code/session_014NJM2BMfJzpvTXUAr26uh1
</commit_message>
<xml_diff>
--- a/docs/开图_用户调研及需求分析报告.docx
+++ b/docs/开图_用户调研及需求分析报告.docx
@@ -410,7 +410,7 @@
                 <w:b w:val="0"/>
                 <w:sz w:val="18"/>
               </w:rPr>
-              <w:t>2025 年国内出游 65.22 亿人次、花费 6.30 万亿元[1]；南京接待游客首破 2 亿人次[2]；小红书月均旅行搜索 16 亿次、同比 +61%[3]</w:t>
+              <w:t>2025 年国内出游 65.22 亿人次、花费 6.30 万亿元；南京接待游客首破 2 亿人次；小红书月均旅行搜索 16 亿次、同比 +61%</w:t>
             </w:r>
           </w:p>
         </w:tc>
@@ -475,7 +475,7 @@
                 <w:b w:val="0"/>
                 <w:sz w:val="18"/>
               </w:rPr>
-              <w:t>媒体调查集中报道 AI 推荐已关门餐厅、算错距离[4]；海外调查约 1/6 用户遇到 AI 虚构目的地[5]</w:t>
+              <w:t>媒体调查集中报道 AI 推荐已关门餐厅、算错距离；海外调查约 1/6 用户遇到 AI 虚构目的地</w:t>
             </w:r>
           </w:p>
         </w:tc>
@@ -538,7 +538,7 @@
                 <w:b w:val="0"/>
                 <w:sz w:val="18"/>
               </w:rPr>
-              <w:t>高德以真实到店行为做「扫街榜」，一年服务 8.8 亿用户[6]</w:t>
+              <w:t>高德以真实到店行为做「扫街榜」，一年服务 8.8 亿用户</w:t>
             </w:r>
           </w:p>
         </w:tc>
@@ -603,7 +603,7 @@
                 <w:b w:val="0"/>
                 <w:sz w:val="18"/>
               </w:rPr>
-              <w:t>外卖综合抽佣可达 20%–30%，监管已要求降费[7]</w:t>
+              <w:t>外卖综合抽佣可达 20%–30%，监管已要求降费</w:t>
             </w:r>
           </w:p>
         </w:tc>
@@ -666,7 +666,7 @@
                 <w:b w:val="0"/>
                 <w:sz w:val="18"/>
               </w:rPr>
-              <w:t>专业 3D 扫描约 0.10 美元/平方英尺[8]；VR 全景按场景计费[9]；X4 Air 售价 2399 元、8K 全景[10]</w:t>
+              <w:t>专业 3D 扫描约 0.10 美元/平方英尺；VR 全景按场景计费；X4 Air 售价 2399 元、8K 全景</w:t>
             </w:r>
           </w:p>
         </w:tc>
@@ -1226,7 +1226,7 @@
                 <w:b w:val="0"/>
                 <w:sz w:val="18"/>
               </w:rPr>
-              <w:t>文旅部、地方政府统计，行业研究与平台公告，21 条来源（附录 A）</w:t>
+              <w:t>文旅部、地方政府统计，行业研究与平台公告，21 条公开来源</w:t>
             </w:r>
           </w:p>
         </w:tc>
@@ -1450,7 +1450,7 @@
                 <w:b w:val="0"/>
                 <w:sz w:val="18"/>
               </w:rPr>
-              <w:t>执行中（附录 B）</w:t>
+              <w:t>执行中</w:t>
             </w:r>
           </w:p>
         </w:tc>
@@ -1512,7 +1512,7 @@
                 <w:b w:val="0"/>
                 <w:sz w:val="18"/>
               </w:rPr>
-              <w:t>执行中（附录 C）</w:t>
+              <w:t>执行中</w:t>
             </w:r>
           </w:p>
         </w:tc>
@@ -1569,7 +1569,7 @@
         <w:rPr>
           <w:b w:val="0"/>
         </w:rPr>
-        <w:t>：2025 年国内居民出游 65.22 亿人次（+16.2%），花费 6.30 万亿元（+9.5%）【A】[1]。南京接待游客 20052.8 万人次，总花费 2390.2 亿元，均居江苏第一【A】[2]。本项目三个场景都在南京：仙林度假村、栖霞山、老门东。</w:t>
+        <w:t>：2025 年国内居民出游 65.22 亿人次（+16.2%），花费 6.30 万亿元（+9.5%）【A】。南京接待游客 20052.8 万人次，总花费 2390.2 亿元，均居江苏第一【A】。本项目三个场景都在南京：仙林度假村、栖霞山、老门东。</w:t>
       </w:r>
     </w:p>
     <w:p>
@@ -1586,7 +1586,7 @@
         <w:rPr>
           <w:b w:val="0"/>
         </w:rPr>
-        <w:t>：夫子庙、老门东节假日 12:00–22:00 预约准入【A】[11]；栖霞山红枫季机动车禁止上山，游客全程步行【B】[12]。高峰时段“少走冤枉路”的需求最强。</w:t>
+        <w:t>：夫子庙、老门东节假日 12:00–22:00 预约准入【A】；栖霞山红枫季机动车禁止上山，游客全程步行【B】。高峰时段“少走冤枉路”的需求最强。</w:t>
       </w:r>
     </w:p>
     <w:p>
@@ -1608,7 +1608,7 @@
         <w:rPr>
           <w:b w:val="0"/>
         </w:rPr>
-        <w:t>小红书旅游兴趣月活超过 1 亿，月均旅行相关搜索 16 亿次（+61%）【B】[3]。</w:t>
+        <w:t>小红书旅游兴趣月活超过 1 亿，月均旅行相关搜索 16 亿次（+61%）【B】。</w:t>
       </w:r>
     </w:p>
     <w:p>
@@ -1619,7 +1619,7 @@
         <w:rPr>
           <w:b w:val="0"/>
         </w:rPr>
-        <w:t>各平台纷纷上线 AI 助手：美团「问小团」可推荐并自动领券[13]；大众点评测试基于评价的 AI 助手[14]；携程「问道」、飞猪「问一问」做行程规划[15]；Google Ask Maps 配合 Immersive View（覆盖 150 座城市，可用 NeRF 查看部分餐厅内部）[16]。</w:t>
+        <w:t>各平台纷纷上线 AI 助手：美团「问小团」可推荐并自动领券；大众点评测试基于评价的 AI 助手；携程「问道」、飞猪「问一问」做行程规划；Google Ask Maps 配合 Immersive View（覆盖 150 座城市，可用 NeRF 查看部分餐厅内部）。</w:t>
       </w:r>
     </w:p>
     <w:p>
@@ -1661,7 +1661,7 @@
         <w:rPr>
           <w:b w:val="0"/>
         </w:rPr>
-        <w:t>：外卖综合抽佣可达 20% 以上，含配送与推广约 30%；市场监管总局要求平台为中小商户降费【B】[7]。有调查称超过六成商户认为外卖已不是主要盈利渠道【C】[17]。</w:t>
+        <w:t>：外卖综合抽佣可达 20% 以上，含配送与推广约 30%；市场监管总局要求平台为中小商户降费【B】。有调查称超过六成商户认为外卖已不是主要盈利渠道【C】。</w:t>
       </w:r>
     </w:p>
     <w:p>
@@ -1678,7 +1678,7 @@
         <w:rPr>
           <w:b w:val="0"/>
         </w:rPr>
-        <w:t>：VR 全景按场景计费，热点、导航等功能另外加价【B】[9]；专业 3D 扫描按面积线性计价【B】[8]。内容过时后只能重新外包。</w:t>
+        <w:t>：VR 全景按场景计费，热点、导航等功能另外加价【B】；专业 3D 扫描按面积线性计价【B】。内容过时后只能重新外包。</w:t>
       </w:r>
     </w:p>
     <w:p>
@@ -1706,7 +1706,7 @@
         <w:rPr>
           <w:b w:val="0"/>
         </w:rPr>
-        <w:t>：X4 Air 于 2025-10-28 发布，2399 元，8K 全景，165 g，主打“先拍摄，后取景”【A】[10]。影石全景相机份额长期第一（机构口径约 49%–85%，2025 年起大疆入局）【B】[18]。</w:t>
+        <w:t>：X4 Air 于 2025-10-28 发布，2399 元，8K 全景，165 g，主打“先拍摄，后取景”【A】。影石全景相机份额长期第一（机构口径约 49%–85%，2025 年起大疆入局）【B】。</w:t>
       </w:r>
     </w:p>
     <w:p>
@@ -1723,7 +1723,7 @@
         <w:rPr>
           <w:b w:val="0"/>
         </w:rPr>
-        <w:t>：3DGS 已进入消费级工具（Scaniverse 支持 360 相机 splat）【B】[19]；多模态大模型可做菜牌 OCR 与场景识别，但幻觉问题仍未解决（§4.3 P3）。</w:t>
+        <w:t>：3DGS 已进入消费级工具（Scaniverse 支持 360 相机 splat）【B】；多模态大模型可做菜牌 OCR 与场景识别，但幻觉问题仍未解决（§4.3 P3）。</w:t>
       </w:r>
     </w:p>
     <w:p>
@@ -1757,7 +1757,7 @@
           <w:b w:val="0"/>
           <w:color w:val="33443A"/>
         </w:rPr>
-        <w:t>依据 §3 证据与公开用户声音合成的典型人群，将用附录 B、C 的一手数据校准。</w:t>
+        <w:t>依据 §3 证据与公开用户声音合成的典型人群，将用访谈与现场测试的一手数据校准。</w:t>
       </w:r>
     </w:p>
     <w:tbl>
@@ -2738,7 +2738,7 @@
         <w:rPr>
           <w:b w:val="0"/>
         </w:rPr>
-        <w:t>：【B】AI 与攻略在“开放时段、交通票务、行程衔接这类时效性、地域性极强的信息上很容易出现偏差”，游客反映推荐餐厅“有几家已经关门”[4]。</w:t>
+        <w:t>：【B】AI 与攻略在“开放时段、交通票务、行程衔接这类时效性、地域性极强的信息上很容易出现偏差”，游客反映推荐餐厅“有几家已经关门”。</w:t>
       </w:r>
     </w:p>
     <w:p>
@@ -2761,7 +2761,7 @@
           <w:b w:val="0"/>
           <w:color w:val="33443A"/>
         </w:rPr>
-        <w:t>老门东以箍桶巷为中轴，两侧多条横巷，灰砖白墙相似[20]，节假日还要预约限流[11]；栖霞山红枫季只能步行上山[12]。带娃、带老人时，每段冤枉路都在消耗体力和耐心。</w:t>
+        <w:t>老门东以箍桶巷为中轴，两侧多条横巷，灰砖白墙相似，节假日还要预约限流；栖霞山红枫季只能步行上山。带娃、带老人时，每段冤枉路都在消耗体力和耐心。</w:t>
       </w:r>
     </w:p>
     <w:p>
@@ -2812,7 +2812,7 @@
         <w:rPr>
           <w:b w:val="0"/>
         </w:rPr>
-        <w:t>：Google 用 Immersive View 让用户出发前先“看”餐厅内部[16]，但国内街区与景区内部仍是空白。</w:t>
+        <w:t>：Google 用 Immersive View 让用户出发前先“看”餐厅内部，但国内街区与景区内部仍是空白。</w:t>
       </w:r>
     </w:p>
     <w:p>
@@ -2880,7 +2880,7 @@
         <w:rPr>
           <w:b w:val="0"/>
         </w:rPr>
-        <w:t>【B】AI 称“不走高速回成都全程只有 200 多公里，实际要 400 公里”；飞猪、马蜂窝、携程正用平台真实数据交叉校验模型输出[4]。</w:t>
+        <w:t>【B】AI 称“不走高速回成都全程只有 200 多公里，实际要 400 公里”；飞猪、马蜂窝、携程正用平台真实数据交叉校验模型输出。</w:t>
       </w:r>
     </w:p>
     <w:p>
@@ -2891,7 +2891,7 @@
         <w:rPr>
           <w:b w:val="0"/>
         </w:rPr>
-        <w:t>【B】约 1/6 的受访者遇到过 AI 虚构的旅行目的地[5]。</w:t>
+        <w:t>【B】约 1/6 的受访者遇到过 AI 虚构的旅行目的地。</w:t>
       </w:r>
     </w:p>
     <w:p>
@@ -2902,7 +2902,7 @@
         <w:rPr>
           <w:b w:val="0"/>
         </w:rPr>
-        <w:t>【A/B】高德「扫街榜」用真实导航与到店行为过滤评价，上线即覆盖 160 万家商户，一年服务 8.8 亿用户[6]，说明“行为比评分可信”是强需求。</w:t>
+        <w:t>【A/B】高德「扫街榜」用真实导航与到店行为过滤评价，上线即覆盖 160 万家商户，一年服务 8.8 亿用户，说明“行为比评分可信”是强需求。</w:t>
       </w:r>
     </w:p>
     <w:p>
@@ -2942,7 +2942,7 @@
         <w:rPr>
           <w:b w:val="0"/>
         </w:rPr>
-        <w:t>：【B】外卖综合抽佣可达 20%–30%[7]；【C】超六成商户认为外卖已不是主要盈利渠道[17]。</w:t>
+        <w:t>：【B】外卖综合抽佣可达 20%–30%；【C】超六成商户认为外卖已不是主要盈利渠道。</w:t>
       </w:r>
     </w:p>
     <w:p>
@@ -2987,7 +2987,7 @@
         <w:rPr>
           <w:b w:val="0"/>
         </w:rPr>
-        <w:t>：【B】专业 3D 扫描约 0.10 美元/平方英尺，住宅套餐 400–1000 美元，另收托管费[8]；国内 VR 全景按场景计费，功能单独加价[9]。</w:t>
+        <w:t>：【B】专业 3D 扫描约 0.10 美元/平方英尺，住宅套餐 400–1000 美元，另收托管费；国内 VR 全景按场景计费，功能单独加价。</w:t>
       </w:r>
     </w:p>
     <w:p>
@@ -3044,7 +3044,7 @@
         <w:rPr>
           <w:b w:val="0"/>
         </w:rPr>
-        <w:t>：X4 Air 主打“先拍摄，后取景”[10]，重构图是全景用户的核心工作流；8K 原始长视频体积大，本项目云端默认单文件上限 512 MB，需先拼接、裁剪。</w:t>
+        <w:t>：X4 Air 主打“先拍摄，后取景”，重构图是全景用户的核心工作流；8K 原始长视频体积大，本项目云端默认单文件上限 512 MB，需先拼接、裁剪。</w:t>
       </w:r>
     </w:p>
     <w:p>
@@ -3061,7 +3061,7 @@
         <w:rPr>
           <w:b w:val="0"/>
         </w:rPr>
-        <w:t>：素材复用率、重构图耗时，以及授权为空间内容的意愿与分成期望（附录 B）。</w:t>
+        <w:t>：素材复用率、重构图耗时，以及授权为空间内容的意愿与分成期望。</w:t>
       </w:r>
     </w:p>
     <w:p>
@@ -5853,7 +5853,7 @@
                 <w:b w:val="0"/>
                 <w:sz w:val="18"/>
               </w:rPr>
-              <w:t>大众点评、美团问小团[13][14]、小红书</w:t>
+              <w:t>大众点评、美团问小团、小红书</w:t>
             </w:r>
           </w:p>
         </w:tc>
@@ -5932,7 +5932,7 @@
                 <w:b w:val="0"/>
                 <w:sz w:val="18"/>
               </w:rPr>
-              <w:t>高德扫街榜[6]</w:t>
+              <w:t>高德扫街榜</w:t>
             </w:r>
           </w:p>
         </w:tc>
@@ -6012,7 +6012,7 @@
                 <w:b w:val="0"/>
                 <w:sz w:val="18"/>
               </w:rPr>
-              <w:t>携程问道、飞猪问一问、马蜂窝 AI 路书[15]、Google Ask Maps[16]</w:t>
+              <w:t>携程问道、飞猪问一问、马蜂窝 AI 路书、Google Ask Maps</w:t>
             </w:r>
           </w:p>
         </w:tc>
@@ -6042,7 +6042,7 @@
                 <w:b w:val="0"/>
                 <w:sz w:val="18"/>
               </w:rPr>
-              <w:t>时效与幻觉问题[4][5]；到景点级为止，场地内部是盲区</w:t>
+              <w:t>时效与幻觉问题；到景点级为止，场地内部是盲区</w:t>
             </w:r>
           </w:p>
         </w:tc>
@@ -6091,7 +6091,7 @@
                 <w:b w:val="0"/>
                 <w:sz w:val="18"/>
               </w:rPr>
-              <w:t>720 云[9]、如视[21]、Matterport[8]、Google Immersive View[16]</w:t>
+              <w:t>720 云、如视、Matterport、Google Immersive View</w:t>
             </w:r>
           </w:p>
         </w:tc>
@@ -6171,7 +6171,7 @@
                 <w:b w:val="0"/>
                 <w:sz w:val="18"/>
               </w:rPr>
-              <w:t>Polycam、Scaniverse、KIRI Engine、Luma AI[19]</w:t>
+              <w:t>Polycam、Scaniverse、KIRI Engine、Luma AI</w:t>
             </w:r>
           </w:p>
         </w:tc>
@@ -8173,7 +8173,7 @@
                 <w:b w:val="0"/>
                 <w:sz w:val="18"/>
               </w:rPr>
-              <w:t>现场对照：开图 vs 常用地图 + 点评（附录 C）</w:t>
+              <w:t>现场对照：开图 vs 常用地图 + 点评</w:t>
             </w:r>
           </w:p>
         </w:tc>
@@ -8429,7 +8429,7 @@
                 <w:b w:val="0"/>
                 <w:sz w:val="18"/>
               </w:rPr>
-              <w:t>博主访谈（附录 B）</w:t>
+              <w:t>博主访谈</w:t>
             </w:r>
           </w:p>
         </w:tc>
@@ -8826,1312 +8826,9 @@
         <w:rPr>
           <w:b w:val="0"/>
         </w:rPr>
-        <w:t>：用附录 B、C 的一手数据校准机会分数与指标，用 X4 Air 实拍替换合成样例，在一个场地、两家商户完成真实试点。</w:t>
+        <w:t>：用访谈与现场测试的一手数据校准机会分数与指标，用 X4 Air 实拍替换合成样例，在一个场地、两家商户完成真实试点。</w:t>
       </w:r>
     </w:p>
-    <w:p>
-      <w:pPr>
-        <w:pStyle w:val="Heading2"/>
-      </w:pPr>
-      <w:r>
-        <w:rPr>
-          <w:b w:val="0"/>
-        </w:rPr>
-        <w:t>附录 A：参考来源</w:t>
-      </w:r>
-    </w:p>
-    <w:p>
-      <w:pPr>
-        <w:ind w:left="340" w:hanging="340"/>
-      </w:pPr>
-      <w:r>
-        <w:rPr>
-          <w:b w:val="0"/>
-        </w:rPr>
-        <w:t>1. 文化和旅游部《2025 年国内居民出游数据情况》 https://zwgk.mct.gov.cn/zfxxgkml/tjxx/202601/t20260126_964367.html ；新华网 https://www.news.cn/20260126/8dda85c98d8843e69b256cea591a7d8b/c.html</w:t>
-      </w:r>
-    </w:p>
-    <w:p>
-      <w:pPr>
-        <w:ind w:left="340" w:hanging="340"/>
-      </w:pPr>
-      <w:r>
-        <w:rPr>
-          <w:b w:val="0"/>
-        </w:rPr>
-        <w:t>2. 人民网江苏《2025 年 2 亿人次游南京 实现游客总花费 2390.2 亿元》 http://js.people.com.cn/n2/2026/0128/c360301-41485061.html</w:t>
-      </w:r>
-    </w:p>
-    <w:p>
-      <w:pPr>
-        <w:ind w:left="340" w:hanging="340"/>
-      </w:pPr>
-      <w:r>
-        <w:rPr>
-          <w:b w:val="0"/>
-        </w:rPr>
-        <w:t>3. 环球旅讯《小红书，如何成为文旅生意的新增量？》 https://www.traveldaily.cn/article/188165 ；小红书《2025 年文旅灵感出游种草指南》 https://www.fxbaogao.com/detail/4699868</w:t>
-      </w:r>
-    </w:p>
-    <w:p>
-      <w:pPr>
-        <w:ind w:left="340" w:hanging="340"/>
-      </w:pPr>
-      <w:r>
-        <w:rPr>
-          <w:b w:val="0"/>
-        </w:rPr>
-        <w:t>4. 齐鲁晚报·壹点调查《频繁“踩坑”，AI 旅游攻略还有不少“幻觉”》 https://www.qlwb.com.cn/detail/27757489.html ；虎嗅 https://www.huxiu.com/article/4856404.html ；21 经济网 https://www.21jingji.com/article/20260506/herald/8029db35dc1f40a3610a6a719bea1e0e.html</w:t>
-      </w:r>
-    </w:p>
-    <w:p>
-      <w:pPr>
-        <w:ind w:left="340" w:hanging="340"/>
-      </w:pPr>
-      <w:r>
-        <w:rPr>
-          <w:b w:val="0"/>
-        </w:rPr>
-        <w:t>5. KVIA / Stacker, *Survey: AI hallucinated travel destinations for 1 in 6 users* https://kvia.com/entertainment/stacker-travel/2026/09/16/survey-ai-hallucinated-travel-destinations-for-1-in-6-users/</w:t>
-      </w:r>
-    </w:p>
-    <w:p>
-      <w:pPr>
-        <w:ind w:left="340" w:hanging="340"/>
-      </w:pPr>
-      <w:r>
-        <w:rPr>
-          <w:b w:val="0"/>
-        </w:rPr>
-        <w:t>6. 高德扫街榜：SocialBeta https://socialbeta.com/campaign/25983 ；知乎 https://zhuanlan.zhihu.com/p/1949061774071533852 ；腾讯新闻（一周年数据） https://news.qq.com/rain/a/20260911A04BMW00</w:t>
-      </w:r>
-    </w:p>
-    <w:p>
-      <w:pPr>
-        <w:ind w:left="340" w:hanging="340"/>
-      </w:pPr>
-      <w:r>
-        <w:rPr>
-          <w:b w:val="0"/>
-        </w:rPr>
-        <w:t>7. 腾讯新闻《京东美团争夺的外卖业务，究竟有多赚钱》 https://news.qq.com/rain/a/20250429A07YUS00 ；网经社《市监总局发布〈指南〉要求降低商家“高佣金、高收费”》 https://www.100ec.cn/detail--6649617.html</w:t>
-      </w:r>
-    </w:p>
-    <w:p>
-      <w:pPr>
-        <w:ind w:left="340" w:hanging="340"/>
-      </w:pPr>
-      <w:r>
-        <w:rPr>
-          <w:b w:val="0"/>
-        </w:rPr>
-        <w:t>8. Matterport 官方价格 https://matterport.com/plans ；PricingLink https://pricinglink.com/knowledge-base/3d-matterport-virtual-tours/how-much-to-charge-for-matterport-scan/</w:t>
-      </w:r>
-    </w:p>
-    <w:p>
-      <w:pPr>
-        <w:ind w:left="340" w:hanging="340"/>
-      </w:pPr>
-      <w:r>
-        <w:rPr>
-          <w:b w:val="0"/>
-        </w:rPr>
-        <w:t>9. 720 云《智慧文旅解决方案》 https://www.720yun.com/solution/tourism ；商迪 3D《720 云 VR 全景制作一般怎么收费》 https://www.web3di.com/article-1318.html</w:t>
-      </w:r>
-    </w:p>
-    <w:p>
-      <w:pPr>
-        <w:ind w:left="340" w:hanging="340"/>
-      </w:pPr>
-      <w:r>
-        <w:rPr>
-          <w:b w:val="0"/>
-        </w:rPr>
-        <w:t>10. IT之家《影石 Insta360 X4 Air 上市》 https://www.ithome.com/0/893/059.htm ；影石官方 https://www.insta360.com/cn/product/insta360-x4-air</w:t>
-      </w:r>
-    </w:p>
-    <w:p>
-      <w:pPr>
-        <w:ind w:left="340" w:hanging="340"/>
-      </w:pPr>
-      <w:r>
-        <w:rPr>
-          <w:b w:val="0"/>
-        </w:rPr>
-        <w:t>11. 南京本地宝《夫子庙、老门东景区 12:00 至 22:00 实施预约准入》 https://nj.bendibao.com/news/2023428/153261.shtm</w:t>
-      </w:r>
-    </w:p>
-    <w:p>
-      <w:pPr>
-        <w:ind w:left="340" w:hanging="340"/>
-      </w:pPr>
-      <w:r>
-        <w:rPr>
-          <w:b w:val="0"/>
-        </w:rPr>
-        <w:t>12. 南京本地宝《南京栖霞山红叶观赏攻略》 https://nj.bendibao.com/xiuxian/2025113/177052.shtm ；新华报业 https://www.xhby.net/content/s68f754c6e4b0f3ec5f07bfea.html</w:t>
-      </w:r>
-    </w:p>
-    <w:p>
-      <w:pPr>
-        <w:ind w:left="340" w:hanging="340"/>
-      </w:pPr>
-      <w:r>
-        <w:rPr>
-          <w:b w:val="0"/>
-        </w:rPr>
-        <w:t>13. 央广网《美团升级“问小团”加入 AI 大战》 https://travel.cnr.cn/hydt/20260213/t20260213_527525984.shtml</w:t>
-      </w:r>
-    </w:p>
-    <w:p>
-      <w:pPr>
-        <w:ind w:left="340" w:hanging="340"/>
-      </w:pPr>
-      <w:r>
-        <w:rPr>
-          <w:b w:val="0"/>
-        </w:rPr>
-        <w:t>14. 36氪《美团持续押注 AI，这次点将到了大众点评》 https://www.36kr.com/p/3105440966987267</w:t>
-      </w:r>
-    </w:p>
-    <w:p>
-      <w:pPr>
-        <w:ind w:left="340" w:hanging="340"/>
-      </w:pPr>
-      <w:r>
-        <w:rPr>
-          <w:b w:val="0"/>
-        </w:rPr>
-        <w:t>15. DoNews《测评三款 AI 旅行助手：携程问道、飞猪问一问与马蜂窝 AI 路书》 https://www.donews.com/news/detail/4/5199664.html</w:t>
-      </w:r>
-    </w:p>
-    <w:p>
-      <w:pPr>
-        <w:ind w:left="340" w:hanging="340"/>
-      </w:pPr>
-      <w:r>
-        <w:rPr>
-          <w:b w:val="0"/>
-        </w:rPr>
-        <w:t>16. Google Blog, *Google Maps updates: Gemini arrives, Immersive View expands* https://blog.google/products-and-platforms/products/maps/gemini-google-maps-navigation-updates/</w:t>
-      </w:r>
-    </w:p>
-    <w:p>
-      <w:pPr>
-        <w:ind w:left="340" w:hanging="340"/>
-      </w:pPr>
-      <w:r>
-        <w:rPr>
-          <w:b w:val="0"/>
-        </w:rPr>
-        <w:t>17. 物流指闻《美团外卖佣金调查》 https://www.headscm.com/Fingertip/detail/id/11305.html</w:t>
-      </w:r>
-    </w:p>
-    <w:p>
-      <w:pPr>
-        <w:ind w:left="340" w:hanging="340"/>
-      </w:pPr>
-      <w:r>
-        <w:rPr>
-          <w:b w:val="0"/>
-        </w:rPr>
-        <w:t>18. 蜂鸟 PhotoFans《影石全景相机 2025 年全球市占率超 85%》 https://article.photofans.cn/article-63431-1.html ；OFweek《市场份额罗生门》 https://optics.ofweek.com/2025-11/ART-250003-8420-30674197.html</w:t>
-      </w:r>
-    </w:p>
-    <w:p>
-      <w:pPr>
-        <w:ind w:left="340" w:hanging="340"/>
-      </w:pPr>
-      <w:r>
-        <w:rPr>
-          <w:b w:val="0"/>
-        </w:rPr>
-        <w:t>19. SkyeBrowse *Polycam vs Scaniverse* https://www.skyebrowse.com/news/posts/polycam-vs-scaniverse ；Real Horizons https://realhorizons.ai/blog/gaussian-splatting-software/</w:t>
-      </w:r>
-    </w:p>
-    <w:p>
-      <w:pPr>
-        <w:ind w:left="340" w:hanging="340"/>
-      </w:pPr>
-      <w:r>
-        <w:rPr>
-          <w:b w:val="0"/>
-        </w:rPr>
-        <w:t>20. 南京地方志《古风新韵门东行》 https://dfz.nanjing.gov.cn/gzdt/202411/t20241101_4998828.html</w:t>
-      </w:r>
-    </w:p>
-    <w:p>
-      <w:pPr>
-        <w:ind w:left="340" w:hanging="340"/>
-      </w:pPr>
-      <w:r>
-        <w:rPr>
-          <w:b w:val="0"/>
-        </w:rPr>
-        <w:t>21. 如视 Realsee《VR 导览，3D 实景导航解决方案》 https://www.realsee.com/cn/navigation</w:t>
-      </w:r>
-    </w:p>
-    <w:p>
-      <w:pPr>
-        <w:pStyle w:val="Heading2"/>
-      </w:pPr>
-      <w:r>
-        <w:rPr>
-          <w:b w:val="0"/>
-        </w:rPr>
-        <w:t>附录 B：摄影博主深度访谈（3 人次）</w:t>
-      </w:r>
-    </w:p>
-    <w:p>
-      <w:r>
-        <w:rPr>
-          <w:b/>
-        </w:rPr>
-        <w:t>目的</w:t>
-      </w:r>
-      <w:r>
-        <w:rPr>
-          <w:b w:val="0"/>
-        </w:rPr>
-        <w:t>：验证 P6、H2、H5。线上半结构化访谈，经同意录音，匿名引用。</w:t>
-      </w:r>
-    </w:p>
-    <w:p>
-      <w:r>
-        <w:rPr>
-          <w:b/>
-        </w:rPr>
-        <w:t>提纲</w:t>
-      </w:r>
-      <w:r>
-        <w:rPr>
-          <w:b w:val="0"/>
-        </w:rPr>
-        <w:t>：</w:t>
-      </w:r>
-    </w:p>
-    <w:p>
-      <w:pPr>
-        <w:ind w:left="340" w:hanging="340"/>
-      </w:pPr>
-      <w:r>
-        <w:rPr>
-          <w:b w:val="0"/>
-        </w:rPr>
-        <w:t>1. 从事影像创作多久？主要平台与题材？使用哪款全景相机？</w:t>
-      </w:r>
-    </w:p>
-    <w:p>
-      <w:pPr>
-        <w:ind w:left="340" w:hanging="340"/>
-      </w:pPr>
-      <w:r>
-        <w:rPr>
-          <w:b w:val="0"/>
-        </w:rPr>
-        <w:t>2. 最近一次外拍的完整流程是什么？哪一步最耗时？</w:t>
-      </w:r>
-    </w:p>
-    <w:p>
-      <w:pPr>
-        <w:ind w:left="340" w:hanging="340"/>
-      </w:pPr>
-      <w:r>
-        <w:rPr>
-          <w:b w:val="0"/>
-        </w:rPr>
-        <w:t>3. 一次外拍的素材最终用了多少比例？其余如何处理？</w:t>
-      </w:r>
-    </w:p>
-    <w:p>
-      <w:pPr>
-        <w:ind w:left="340" w:hanging="340"/>
-      </w:pPr>
-      <w:r>
-        <w:rPr>
-          <w:b w:val="0"/>
-        </w:rPr>
-        <w:t>4. 如果素材可以一键变成景区或商户的“可逛空间”，你愿意吗？顾虑是什么（版权、署名、分成、隐私）？</w:t>
-      </w:r>
-    </w:p>
-    <w:p>
-      <w:pPr>
-        <w:ind w:left="340" w:hanging="340"/>
-      </w:pPr>
-      <w:r>
-        <w:rPr>
-          <w:b w:val="0"/>
-        </w:rPr>
-        <w:t>5. 与商家合作时，对方最关心什么？你能证明带来了多少到店吗？</w:t>
-      </w:r>
-    </w:p>
-    <w:p>
-      <w:pPr>
-        <w:ind w:left="340" w:hanging="340"/>
-      </w:pPr>
-      <w:r>
-        <w:rPr>
-          <w:b w:val="0"/>
-        </w:rPr>
-        <w:t>6. 用过 AI 做旅行规划或剪辑吗？最不信任它的地方是什么？</w:t>
-      </w:r>
-    </w:p>
-    <w:p>
-      <w:pPr>
-        <w:ind w:left="340" w:hanging="340"/>
-      </w:pPr>
-      <w:r>
-        <w:rPr>
-          <w:b w:val="0"/>
-        </w:rPr>
-        <w:t>7. 观看开图演示后，最有用和最没用的功能各是什么？</w:t>
-      </w:r>
-    </w:p>
-    <w:tbl>
-      <w:tblPr>
-        <w:tblStyle w:val="TableGrid"/>
-        <w:tblW w:type="auto" w:w="0"/>
-        <w:tblLook w:firstColumn="1" w:firstRow="1" w:lastColumn="0" w:lastRow="0" w:noHBand="0" w:noVBand="1" w:val="04A0"/>
-      </w:tblPr>
-      <w:tblGrid>
-        <w:gridCol w:w="1205"/>
-        <w:gridCol w:w="1205"/>
-        <w:gridCol w:w="1205"/>
-        <w:gridCol w:w="1205"/>
-        <w:gridCol w:w="1205"/>
-        <w:gridCol w:w="1205"/>
-        <w:gridCol w:w="1205"/>
-        <w:gridCol w:w="1205"/>
-      </w:tblGrid>
-      <w:tr>
-        <w:tc>
-          <w:tcPr>
-            <w:tcW w:type="dxa" w:w="1205"/>
-            <w:shd w:val="clear" w:color="auto" w:fill="0F3B40"/>
-          </w:tcPr>
-          <w:p>
-            <w:r/>
-            <w:r>
-              <w:rPr>
-                <w:b/>
-                <w:color w:val="FFFFFF"/>
-                <w:sz w:val="18"/>
-              </w:rPr>
-              <w:t>编号</w:t>
-            </w:r>
-          </w:p>
-        </w:tc>
-        <w:tc>
-          <w:tcPr>
-            <w:tcW w:type="dxa" w:w="1205"/>
-            <w:shd w:val="clear" w:color="auto" w:fill="0F3B40"/>
-          </w:tcPr>
-          <w:p>
-            <w:r/>
-            <w:r>
-              <w:rPr>
-                <w:b/>
-                <w:color w:val="FFFFFF"/>
-                <w:sz w:val="18"/>
-              </w:rPr>
-              <w:t>领域 / 粉丝量级</w:t>
-            </w:r>
-          </w:p>
-        </w:tc>
-        <w:tc>
-          <w:tcPr>
-            <w:tcW w:type="dxa" w:w="1205"/>
-            <w:shd w:val="clear" w:color="auto" w:fill="0F3B40"/>
-          </w:tcPr>
-          <w:p>
-            <w:r/>
-            <w:r>
-              <w:rPr>
-                <w:b/>
-                <w:color w:val="FFFFFF"/>
-                <w:sz w:val="18"/>
-              </w:rPr>
-              <w:t>设备</w:t>
-            </w:r>
-          </w:p>
-        </w:tc>
-        <w:tc>
-          <w:tcPr>
-            <w:tcW w:type="dxa" w:w="1205"/>
-            <w:shd w:val="clear" w:color="auto" w:fill="0F3B40"/>
-          </w:tcPr>
-          <w:p>
-            <w:r/>
-            <w:r>
-              <w:rPr>
-                <w:b/>
-                <w:color w:val="FFFFFF"/>
-                <w:sz w:val="18"/>
-              </w:rPr>
-              <w:t>最痛的一步（原话）</w:t>
-            </w:r>
-          </w:p>
-        </w:tc>
-        <w:tc>
-          <w:tcPr>
-            <w:tcW w:type="dxa" w:w="1205"/>
-            <w:shd w:val="clear" w:color="auto" w:fill="0F3B40"/>
-          </w:tcPr>
-          <w:p>
-            <w:r/>
-            <w:r>
-              <w:rPr>
-                <w:b/>
-                <w:color w:val="FFFFFF"/>
-                <w:sz w:val="18"/>
-              </w:rPr>
-              <w:t>素材复用比例</w:t>
-            </w:r>
-          </w:p>
-        </w:tc>
-        <w:tc>
-          <w:tcPr>
-            <w:tcW w:type="dxa" w:w="1205"/>
-            <w:shd w:val="clear" w:color="auto" w:fill="0F3B40"/>
-          </w:tcPr>
-          <w:p>
-            <w:r/>
-            <w:r>
-              <w:rPr>
-                <w:b/>
-                <w:color w:val="FFFFFF"/>
-                <w:sz w:val="18"/>
-              </w:rPr>
-              <w:t>空间服务意愿（1–7）</w:t>
-            </w:r>
-          </w:p>
-        </w:tc>
-        <w:tc>
-          <w:tcPr>
-            <w:tcW w:type="dxa" w:w="1205"/>
-            <w:shd w:val="clear" w:color="auto" w:fill="0F3B40"/>
-          </w:tcPr>
-          <w:p>
-            <w:r/>
-            <w:r>
-              <w:rPr>
-                <w:b/>
-                <w:color w:val="FFFFFF"/>
-                <w:sz w:val="18"/>
-              </w:rPr>
-              <w:t>主要顾虑</w:t>
-            </w:r>
-          </w:p>
-        </w:tc>
-        <w:tc>
-          <w:tcPr>
-            <w:tcW w:type="dxa" w:w="1205"/>
-            <w:shd w:val="clear" w:color="auto" w:fill="0F3B40"/>
-          </w:tcPr>
-          <w:p>
-            <w:r/>
-            <w:r>
-              <w:rPr>
-                <w:b/>
-                <w:color w:val="FFFFFF"/>
-                <w:sz w:val="18"/>
-              </w:rPr>
-              <w:t>建议</w:t>
-            </w:r>
-          </w:p>
-        </w:tc>
-      </w:tr>
-      <w:tr>
-        <w:tc>
-          <w:tcPr>
-            <w:tcW w:type="dxa" w:w="1205"/>
-          </w:tcPr>
-          <w:p>
-            <w:r/>
-            <w:r>
-              <w:rPr>
-                <w:b w:val="0"/>
-                <w:sz w:val="18"/>
-              </w:rPr>
-              <w:t>B1</w:t>
-            </w:r>
-          </w:p>
-        </w:tc>
-        <w:tc>
-          <w:tcPr>
-            <w:tcW w:type="dxa" w:w="1205"/>
-          </w:tcPr>
-          <w:p>
-            <w:r/>
-          </w:p>
-        </w:tc>
-        <w:tc>
-          <w:tcPr>
-            <w:tcW w:type="dxa" w:w="1205"/>
-          </w:tcPr>
-          <w:p>
-            <w:r/>
-          </w:p>
-        </w:tc>
-        <w:tc>
-          <w:tcPr>
-            <w:tcW w:type="dxa" w:w="1205"/>
-          </w:tcPr>
-          <w:p>
-            <w:r/>
-          </w:p>
-        </w:tc>
-        <w:tc>
-          <w:tcPr>
-            <w:tcW w:type="dxa" w:w="1205"/>
-          </w:tcPr>
-          <w:p>
-            <w:r/>
-          </w:p>
-        </w:tc>
-        <w:tc>
-          <w:tcPr>
-            <w:tcW w:type="dxa" w:w="1205"/>
-          </w:tcPr>
-          <w:p>
-            <w:r/>
-          </w:p>
-        </w:tc>
-        <w:tc>
-          <w:tcPr>
-            <w:tcW w:type="dxa" w:w="1205"/>
-          </w:tcPr>
-          <w:p>
-            <w:r/>
-          </w:p>
-        </w:tc>
-        <w:tc>
-          <w:tcPr>
-            <w:tcW w:type="dxa" w:w="1205"/>
-          </w:tcPr>
-          <w:p>
-            <w:r/>
-          </w:p>
-        </w:tc>
-      </w:tr>
-      <w:tr>
-        <w:tc>
-          <w:tcPr>
-            <w:tcW w:type="dxa" w:w="1205"/>
-            <w:shd w:val="clear" w:color="auto" w:fill="F2F7F6"/>
-          </w:tcPr>
-          <w:p>
-            <w:r/>
-            <w:r>
-              <w:rPr>
-                <w:b w:val="0"/>
-                <w:sz w:val="18"/>
-              </w:rPr>
-              <w:t>B2</w:t>
-            </w:r>
-          </w:p>
-        </w:tc>
-        <w:tc>
-          <w:tcPr>
-            <w:tcW w:type="dxa" w:w="1205"/>
-            <w:shd w:val="clear" w:color="auto" w:fill="F2F7F6"/>
-          </w:tcPr>
-          <w:p>
-            <w:r/>
-          </w:p>
-        </w:tc>
-        <w:tc>
-          <w:tcPr>
-            <w:tcW w:type="dxa" w:w="1205"/>
-            <w:shd w:val="clear" w:color="auto" w:fill="F2F7F6"/>
-          </w:tcPr>
-          <w:p>
-            <w:r/>
-          </w:p>
-        </w:tc>
-        <w:tc>
-          <w:tcPr>
-            <w:tcW w:type="dxa" w:w="1205"/>
-            <w:shd w:val="clear" w:color="auto" w:fill="F2F7F6"/>
-          </w:tcPr>
-          <w:p>
-            <w:r/>
-          </w:p>
-        </w:tc>
-        <w:tc>
-          <w:tcPr>
-            <w:tcW w:type="dxa" w:w="1205"/>
-            <w:shd w:val="clear" w:color="auto" w:fill="F2F7F6"/>
-          </w:tcPr>
-          <w:p>
-            <w:r/>
-          </w:p>
-        </w:tc>
-        <w:tc>
-          <w:tcPr>
-            <w:tcW w:type="dxa" w:w="1205"/>
-            <w:shd w:val="clear" w:color="auto" w:fill="F2F7F6"/>
-          </w:tcPr>
-          <w:p>
-            <w:r/>
-          </w:p>
-        </w:tc>
-        <w:tc>
-          <w:tcPr>
-            <w:tcW w:type="dxa" w:w="1205"/>
-            <w:shd w:val="clear" w:color="auto" w:fill="F2F7F6"/>
-          </w:tcPr>
-          <w:p>
-            <w:r/>
-          </w:p>
-        </w:tc>
-        <w:tc>
-          <w:tcPr>
-            <w:tcW w:type="dxa" w:w="1205"/>
-            <w:shd w:val="clear" w:color="auto" w:fill="F2F7F6"/>
-          </w:tcPr>
-          <w:p>
-            <w:r/>
-          </w:p>
-        </w:tc>
-      </w:tr>
-      <w:tr>
-        <w:tc>
-          <w:tcPr>
-            <w:tcW w:type="dxa" w:w="1205"/>
-          </w:tcPr>
-          <w:p>
-            <w:r/>
-            <w:r>
-              <w:rPr>
-                <w:b w:val="0"/>
-                <w:sz w:val="18"/>
-              </w:rPr>
-              <w:t>B3</w:t>
-            </w:r>
-          </w:p>
-        </w:tc>
-        <w:tc>
-          <w:tcPr>
-            <w:tcW w:type="dxa" w:w="1205"/>
-          </w:tcPr>
-          <w:p>
-            <w:r/>
-          </w:p>
-        </w:tc>
-        <w:tc>
-          <w:tcPr>
-            <w:tcW w:type="dxa" w:w="1205"/>
-          </w:tcPr>
-          <w:p>
-            <w:r/>
-          </w:p>
-        </w:tc>
-        <w:tc>
-          <w:tcPr>
-            <w:tcW w:type="dxa" w:w="1205"/>
-          </w:tcPr>
-          <w:p>
-            <w:r/>
-          </w:p>
-        </w:tc>
-        <w:tc>
-          <w:tcPr>
-            <w:tcW w:type="dxa" w:w="1205"/>
-          </w:tcPr>
-          <w:p>
-            <w:r/>
-          </w:p>
-        </w:tc>
-        <w:tc>
-          <w:tcPr>
-            <w:tcW w:type="dxa" w:w="1205"/>
-          </w:tcPr>
-          <w:p>
-            <w:r/>
-          </w:p>
-        </w:tc>
-        <w:tc>
-          <w:tcPr>
-            <w:tcW w:type="dxa" w:w="1205"/>
-          </w:tcPr>
-          <w:p>
-            <w:r/>
-          </w:p>
-        </w:tc>
-        <w:tc>
-          <w:tcPr>
-            <w:tcW w:type="dxa" w:w="1205"/>
-          </w:tcPr>
-          <w:p>
-            <w:r/>
-          </w:p>
-        </w:tc>
-      </w:tr>
-    </w:tbl>
-    <w:p/>
-    <w:p>
-      <w:pPr>
-        <w:pStyle w:val="Heading2"/>
-      </w:pPr>
-      <w:r>
-        <w:rPr>
-          <w:b w:val="0"/>
-        </w:rPr>
-        <w:t>附录 C：现场可用性测试</w:t>
-      </w:r>
-    </w:p>
-    <w:p>
-      <w:r>
-        <w:rPr>
-          <w:b/>
-        </w:rPr>
-        <w:t>任务</w:t>
-      </w:r>
-      <w:r>
-        <w:rPr>
-          <w:b w:val="0"/>
-        </w:rPr>
-        <w:t>：“第一次来这里，找一家 80 元以内、适合两个人的餐饮点并到店。”参与者分别用常用地图 / 点评 App 和开图完成，顺序交替以抵消学习效应。</w:t>
-      </w:r>
-    </w:p>
-    <w:tbl>
-      <w:tblPr>
-        <w:tblStyle w:val="TableGrid"/>
-        <w:tblW w:type="auto" w:w="0"/>
-        <w:tblLook w:firstColumn="1" w:firstRow="1" w:lastColumn="0" w:lastRow="0" w:noHBand="0" w:noVBand="1" w:val="04A0"/>
-      </w:tblPr>
-      <w:tblGrid>
-        <w:gridCol w:w="1205"/>
-        <w:gridCol w:w="1205"/>
-        <w:gridCol w:w="1205"/>
-        <w:gridCol w:w="1205"/>
-        <w:gridCol w:w="1205"/>
-        <w:gridCol w:w="1205"/>
-        <w:gridCol w:w="1205"/>
-        <w:gridCol w:w="1205"/>
-      </w:tblGrid>
-      <w:tr>
-        <w:tc>
-          <w:tcPr>
-            <w:tcW w:type="dxa" w:w="1205"/>
-            <w:shd w:val="clear" w:color="auto" w:fill="0F3B40"/>
-          </w:tcPr>
-          <w:p>
-            <w:r/>
-            <w:r>
-              <w:rPr>
-                <w:b/>
-                <w:color w:val="FFFFFF"/>
-                <w:sz w:val="18"/>
-              </w:rPr>
-              <w:t>编号</w:t>
-            </w:r>
-          </w:p>
-        </w:tc>
-        <w:tc>
-          <w:tcPr>
-            <w:tcW w:type="dxa" w:w="1205"/>
-            <w:shd w:val="clear" w:color="auto" w:fill="0F3B40"/>
-          </w:tcPr>
-          <w:p>
-            <w:r/>
-            <w:r>
-              <w:rPr>
-                <w:b/>
-                <w:color w:val="FFFFFF"/>
-                <w:sz w:val="18"/>
-              </w:rPr>
-              <w:t>身份</w:t>
-            </w:r>
-          </w:p>
-        </w:tc>
-        <w:tc>
-          <w:tcPr>
-            <w:tcW w:type="dxa" w:w="1205"/>
-            <w:shd w:val="clear" w:color="auto" w:fill="0F3B40"/>
-          </w:tcPr>
-          <w:p>
-            <w:r/>
-            <w:r>
-              <w:rPr>
-                <w:b/>
-                <w:color w:val="FFFFFF"/>
-                <w:sz w:val="18"/>
-              </w:rPr>
-              <w:t>常用工具耗时</w:t>
-            </w:r>
-          </w:p>
-        </w:tc>
-        <w:tc>
-          <w:tcPr>
-            <w:tcW w:type="dxa" w:w="1205"/>
-            <w:shd w:val="clear" w:color="auto" w:fill="0F3B40"/>
-          </w:tcPr>
-          <w:p>
-            <w:r/>
-            <w:r>
-              <w:rPr>
-                <w:b/>
-                <w:color w:val="FFFFFF"/>
-                <w:sz w:val="18"/>
-              </w:rPr>
-              <w:t>开图耗时</w:t>
-            </w:r>
-          </w:p>
-        </w:tc>
-        <w:tc>
-          <w:tcPr>
-            <w:tcW w:type="dxa" w:w="1205"/>
-            <w:shd w:val="clear" w:color="auto" w:fill="0F3B40"/>
-          </w:tcPr>
-          <w:p>
-            <w:r/>
-            <w:r>
-              <w:rPr>
-                <w:b/>
-                <w:color w:val="FFFFFF"/>
-                <w:sz w:val="18"/>
-              </w:rPr>
-              <w:t>误找（常用 / 开图）</w:t>
-            </w:r>
-          </w:p>
-        </w:tc>
-        <w:tc>
-          <w:tcPr>
-            <w:tcW w:type="dxa" w:w="1205"/>
-            <w:shd w:val="clear" w:color="auto" w:fill="0F3B40"/>
-          </w:tcPr>
-          <w:p>
-            <w:r/>
-            <w:r>
-              <w:rPr>
-                <w:b/>
-                <w:color w:val="FFFFFF"/>
-                <w:sz w:val="18"/>
-              </w:rPr>
-              <w:t>是否领券</w:t>
-            </w:r>
-          </w:p>
-        </w:tc>
-        <w:tc>
-          <w:tcPr>
-            <w:tcW w:type="dxa" w:w="1205"/>
-            <w:shd w:val="clear" w:color="auto" w:fill="0F3B40"/>
-          </w:tcPr>
-          <w:p>
-            <w:r/>
-            <w:r>
-              <w:rPr>
-                <w:b/>
-                <w:color w:val="FFFFFF"/>
-                <w:sz w:val="18"/>
-              </w:rPr>
-              <w:t>SUS</w:t>
-            </w:r>
-          </w:p>
-        </w:tc>
-        <w:tc>
-          <w:tcPr>
-            <w:tcW w:type="dxa" w:w="1205"/>
-            <w:shd w:val="clear" w:color="auto" w:fill="0F3B40"/>
-          </w:tcPr>
-          <w:p>
-            <w:r/>
-            <w:r>
-              <w:rPr>
-                <w:b/>
-                <w:color w:val="FFFFFF"/>
-                <w:sz w:val="18"/>
-              </w:rPr>
-              <w:t>一句话评价</w:t>
-            </w:r>
-          </w:p>
-        </w:tc>
-      </w:tr>
-      <w:tr>
-        <w:tc>
-          <w:tcPr>
-            <w:tcW w:type="dxa" w:w="1205"/>
-          </w:tcPr>
-          <w:p>
-            <w:r/>
-            <w:r>
-              <w:rPr>
-                <w:b w:val="0"/>
-                <w:sz w:val="18"/>
-              </w:rPr>
-              <w:t>C1</w:t>
-            </w:r>
-          </w:p>
-        </w:tc>
-        <w:tc>
-          <w:tcPr>
-            <w:tcW w:type="dxa" w:w="1205"/>
-          </w:tcPr>
-          <w:p>
-            <w:r/>
-          </w:p>
-        </w:tc>
-        <w:tc>
-          <w:tcPr>
-            <w:tcW w:type="dxa" w:w="1205"/>
-          </w:tcPr>
-          <w:p>
-            <w:r/>
-          </w:p>
-        </w:tc>
-        <w:tc>
-          <w:tcPr>
-            <w:tcW w:type="dxa" w:w="1205"/>
-          </w:tcPr>
-          <w:p>
-            <w:r/>
-          </w:p>
-        </w:tc>
-        <w:tc>
-          <w:tcPr>
-            <w:tcW w:type="dxa" w:w="1205"/>
-          </w:tcPr>
-          <w:p>
-            <w:r/>
-          </w:p>
-        </w:tc>
-        <w:tc>
-          <w:tcPr>
-            <w:tcW w:type="dxa" w:w="1205"/>
-          </w:tcPr>
-          <w:p>
-            <w:r/>
-          </w:p>
-        </w:tc>
-        <w:tc>
-          <w:tcPr>
-            <w:tcW w:type="dxa" w:w="1205"/>
-          </w:tcPr>
-          <w:p>
-            <w:r/>
-          </w:p>
-        </w:tc>
-        <w:tc>
-          <w:tcPr>
-            <w:tcW w:type="dxa" w:w="1205"/>
-          </w:tcPr>
-          <w:p>
-            <w:r/>
-          </w:p>
-        </w:tc>
-      </w:tr>
-      <w:tr>
-        <w:tc>
-          <w:tcPr>
-            <w:tcW w:type="dxa" w:w="1205"/>
-            <w:shd w:val="clear" w:color="auto" w:fill="F2F7F6"/>
-          </w:tcPr>
-          <w:p>
-            <w:r/>
-            <w:r>
-              <w:rPr>
-                <w:b w:val="0"/>
-                <w:sz w:val="18"/>
-              </w:rPr>
-              <w:t>C2</w:t>
-            </w:r>
-          </w:p>
-        </w:tc>
-        <w:tc>
-          <w:tcPr>
-            <w:tcW w:type="dxa" w:w="1205"/>
-            <w:shd w:val="clear" w:color="auto" w:fill="F2F7F6"/>
-          </w:tcPr>
-          <w:p>
-            <w:r/>
-          </w:p>
-        </w:tc>
-        <w:tc>
-          <w:tcPr>
-            <w:tcW w:type="dxa" w:w="1205"/>
-            <w:shd w:val="clear" w:color="auto" w:fill="F2F7F6"/>
-          </w:tcPr>
-          <w:p>
-            <w:r/>
-          </w:p>
-        </w:tc>
-        <w:tc>
-          <w:tcPr>
-            <w:tcW w:type="dxa" w:w="1205"/>
-            <w:shd w:val="clear" w:color="auto" w:fill="F2F7F6"/>
-          </w:tcPr>
-          <w:p>
-            <w:r/>
-          </w:p>
-        </w:tc>
-        <w:tc>
-          <w:tcPr>
-            <w:tcW w:type="dxa" w:w="1205"/>
-            <w:shd w:val="clear" w:color="auto" w:fill="F2F7F6"/>
-          </w:tcPr>
-          <w:p>
-            <w:r/>
-          </w:p>
-        </w:tc>
-        <w:tc>
-          <w:tcPr>
-            <w:tcW w:type="dxa" w:w="1205"/>
-            <w:shd w:val="clear" w:color="auto" w:fill="F2F7F6"/>
-          </w:tcPr>
-          <w:p>
-            <w:r/>
-          </w:p>
-        </w:tc>
-        <w:tc>
-          <w:tcPr>
-            <w:tcW w:type="dxa" w:w="1205"/>
-            <w:shd w:val="clear" w:color="auto" w:fill="F2F7F6"/>
-          </w:tcPr>
-          <w:p>
-            <w:r/>
-          </w:p>
-        </w:tc>
-        <w:tc>
-          <w:tcPr>
-            <w:tcW w:type="dxa" w:w="1205"/>
-            <w:shd w:val="clear" w:color="auto" w:fill="F2F7F6"/>
-          </w:tcPr>
-          <w:p>
-            <w:r/>
-          </w:p>
-        </w:tc>
-      </w:tr>
-      <w:tr>
-        <w:tc>
-          <w:tcPr>
-            <w:tcW w:type="dxa" w:w="1205"/>
-          </w:tcPr>
-          <w:p>
-            <w:r/>
-            <w:r>
-              <w:rPr>
-                <w:b w:val="0"/>
-                <w:sz w:val="18"/>
-              </w:rPr>
-              <w:t>C3</w:t>
-            </w:r>
-          </w:p>
-        </w:tc>
-        <w:tc>
-          <w:tcPr>
-            <w:tcW w:type="dxa" w:w="1205"/>
-          </w:tcPr>
-          <w:p>
-            <w:r/>
-          </w:p>
-        </w:tc>
-        <w:tc>
-          <w:tcPr>
-            <w:tcW w:type="dxa" w:w="1205"/>
-          </w:tcPr>
-          <w:p>
-            <w:r/>
-          </w:p>
-        </w:tc>
-        <w:tc>
-          <w:tcPr>
-            <w:tcW w:type="dxa" w:w="1205"/>
-          </w:tcPr>
-          <w:p>
-            <w:r/>
-          </w:p>
-        </w:tc>
-        <w:tc>
-          <w:tcPr>
-            <w:tcW w:type="dxa" w:w="1205"/>
-          </w:tcPr>
-          <w:p>
-            <w:r/>
-          </w:p>
-        </w:tc>
-        <w:tc>
-          <w:tcPr>
-            <w:tcW w:type="dxa" w:w="1205"/>
-          </w:tcPr>
-          <w:p>
-            <w:r/>
-          </w:p>
-        </w:tc>
-        <w:tc>
-          <w:tcPr>
-            <w:tcW w:type="dxa" w:w="1205"/>
-          </w:tcPr>
-          <w:p>
-            <w:r/>
-          </w:p>
-        </w:tc>
-        <w:tc>
-          <w:tcPr>
-            <w:tcW w:type="dxa" w:w="1205"/>
-          </w:tcPr>
-          <w:p>
-            <w:r/>
-          </w:p>
-        </w:tc>
-      </w:tr>
-      <w:tr>
-        <w:tc>
-          <w:tcPr>
-            <w:tcW w:type="dxa" w:w="1205"/>
-            <w:shd w:val="clear" w:color="auto" w:fill="F2F7F6"/>
-          </w:tcPr>
-          <w:p>
-            <w:r/>
-            <w:r>
-              <w:rPr>
-                <w:b w:val="0"/>
-                <w:sz w:val="18"/>
-              </w:rPr>
-              <w:t>C4</w:t>
-            </w:r>
-          </w:p>
-        </w:tc>
-        <w:tc>
-          <w:tcPr>
-            <w:tcW w:type="dxa" w:w="1205"/>
-            <w:shd w:val="clear" w:color="auto" w:fill="F2F7F6"/>
-          </w:tcPr>
-          <w:p>
-            <w:r/>
-          </w:p>
-        </w:tc>
-        <w:tc>
-          <w:tcPr>
-            <w:tcW w:type="dxa" w:w="1205"/>
-            <w:shd w:val="clear" w:color="auto" w:fill="F2F7F6"/>
-          </w:tcPr>
-          <w:p>
-            <w:r/>
-          </w:p>
-        </w:tc>
-        <w:tc>
-          <w:tcPr>
-            <w:tcW w:type="dxa" w:w="1205"/>
-            <w:shd w:val="clear" w:color="auto" w:fill="F2F7F6"/>
-          </w:tcPr>
-          <w:p>
-            <w:r/>
-          </w:p>
-        </w:tc>
-        <w:tc>
-          <w:tcPr>
-            <w:tcW w:type="dxa" w:w="1205"/>
-            <w:shd w:val="clear" w:color="auto" w:fill="F2F7F6"/>
-          </w:tcPr>
-          <w:p>
-            <w:r/>
-          </w:p>
-        </w:tc>
-        <w:tc>
-          <w:tcPr>
-            <w:tcW w:type="dxa" w:w="1205"/>
-            <w:shd w:val="clear" w:color="auto" w:fill="F2F7F6"/>
-          </w:tcPr>
-          <w:p>
-            <w:r/>
-          </w:p>
-        </w:tc>
-        <w:tc>
-          <w:tcPr>
-            <w:tcW w:type="dxa" w:w="1205"/>
-            <w:shd w:val="clear" w:color="auto" w:fill="F2F7F6"/>
-          </w:tcPr>
-          <w:p>
-            <w:r/>
-          </w:p>
-        </w:tc>
-        <w:tc>
-          <w:tcPr>
-            <w:tcW w:type="dxa" w:w="1205"/>
-            <w:shd w:val="clear" w:color="auto" w:fill="F2F7F6"/>
-          </w:tcPr>
-          <w:p>
-            <w:r/>
-          </w:p>
-        </w:tc>
-      </w:tr>
-      <w:tr>
-        <w:tc>
-          <w:tcPr>
-            <w:tcW w:type="dxa" w:w="1205"/>
-          </w:tcPr>
-          <w:p>
-            <w:r/>
-            <w:r>
-              <w:rPr>
-                <w:b w:val="0"/>
-                <w:sz w:val="18"/>
-              </w:rPr>
-              <w:t>C5</w:t>
-            </w:r>
-          </w:p>
-        </w:tc>
-        <w:tc>
-          <w:tcPr>
-            <w:tcW w:type="dxa" w:w="1205"/>
-          </w:tcPr>
-          <w:p>
-            <w:r/>
-          </w:p>
-        </w:tc>
-        <w:tc>
-          <w:tcPr>
-            <w:tcW w:type="dxa" w:w="1205"/>
-          </w:tcPr>
-          <w:p>
-            <w:r/>
-          </w:p>
-        </w:tc>
-        <w:tc>
-          <w:tcPr>
-            <w:tcW w:type="dxa" w:w="1205"/>
-          </w:tcPr>
-          <w:p>
-            <w:r/>
-          </w:p>
-        </w:tc>
-        <w:tc>
-          <w:tcPr>
-            <w:tcW w:type="dxa" w:w="1205"/>
-          </w:tcPr>
-          <w:p>
-            <w:r/>
-          </w:p>
-        </w:tc>
-        <w:tc>
-          <w:tcPr>
-            <w:tcW w:type="dxa" w:w="1205"/>
-          </w:tcPr>
-          <w:p>
-            <w:r/>
-          </w:p>
-        </w:tc>
-        <w:tc>
-          <w:tcPr>
-            <w:tcW w:type="dxa" w:w="1205"/>
-          </w:tcPr>
-          <w:p>
-            <w:r/>
-          </w:p>
-        </w:tc>
-        <w:tc>
-          <w:tcPr>
-            <w:tcW w:type="dxa" w:w="1205"/>
-          </w:tcPr>
-          <w:p>
-            <w:r/>
-          </w:p>
-        </w:tc>
-      </w:tr>
-    </w:tbl>
-    <w:p/>
     <w:sectPr>
       <w:pgSz w:w="11906" w:h="16838"/>
       <w:pgMar w:top="1134" w:right="1134" w:bottom="1134" w:left="1134" w:header="720" w:footer="720" w:gutter="0"/>

</xml_diff>